<commit_message>
MRC reflection docs: worksheet style with growing answer boxes
Replace the plain underline writing lines with a bordered, lightly shaded
single-cell table under each question. Word table cells auto-grow as the
student types, giving a clear worksheet look with answer boxes that
expand. Applied to all three reflection templates (Movie Poster,
Panorama, TV/AV).

Co-Authored-By: Claude Opus 4.8 <noreply@anthropic.com>
</commit_message>
<xml_diff>
--- a/assets/mrc/study-guides/MRC_Movie_Poster_Reflection.docx
+++ b/assets/mrc/study-guides/MRC_Movie_Poster_Reflection.docx
@@ -128,12 +128,12 @@
           <w:sz w:val="22"/>
           <w:szCs w:val="22"/>
         </w:rPr>
-        <w:t xml:space="preserve">Answer each question in complete sentences.</w:t>
-      </w:r>
-    </w:p>
-    <w:p>
-      <w:pPr>
-        <w:spacing w:after="60" w:before="280"/>
+        <w:t xml:space="preserve">Answer each question in complete sentences. The box grows as you type.</w:t>
+      </w:r>
+    </w:p>
+    <w:p>
+      <w:pPr>
+        <w:spacing w:after="100" w:before="320"/>
       </w:pPr>
       <w:r>
         <w:rPr>
@@ -158,53 +158,53 @@
         <w:t xml:space="preserve">Which concept did you choose or pitch, and what makes it scary?</w:t>
       </w:r>
     </w:p>
-    <w:p>
-      <w:pPr>
-        <w:pBdr>
-          <w:bottom w:val="single" w:color="BBBBBB" w:sz="6" w:space="1"/>
-        </w:pBdr>
-        <w:spacing w:after="0" w:before="220"/>
-      </w:pPr>
-      <w:r>
-        <w:t xml:space="preserve"/>
-      </w:r>
-    </w:p>
-    <w:p>
-      <w:pPr>
-        <w:pBdr>
-          <w:bottom w:val="single" w:color="BBBBBB" w:sz="6" w:space="1"/>
-        </w:pBdr>
-        <w:spacing w:after="0" w:before="220"/>
-      </w:pPr>
-      <w:r>
-        <w:t xml:space="preserve"/>
-      </w:r>
-    </w:p>
-    <w:p>
-      <w:pPr>
-        <w:pBdr>
-          <w:bottom w:val="single" w:color="BBBBBB" w:sz="6" w:space="1"/>
-        </w:pBdr>
-        <w:spacing w:after="0" w:before="220"/>
-      </w:pPr>
-      <w:r>
-        <w:t xml:space="preserve"/>
-      </w:r>
-    </w:p>
-    <w:p>
-      <w:pPr>
-        <w:pBdr>
-          <w:bottom w:val="single" w:color="BBBBBB" w:sz="6" w:space="1"/>
-        </w:pBdr>
-        <w:spacing w:after="0" w:before="220"/>
-      </w:pPr>
-      <w:r>
-        <w:t xml:space="preserve"/>
-      </w:r>
-    </w:p>
-    <w:p>
-      <w:pPr>
-        <w:spacing w:after="60" w:before="280"/>
+    <w:tbl>
+      <w:tblPr>
+        <w:tblW w:type="dxa" w:w="9360"/>
+        <w:tblBorders>
+          <w:top w:val="single" w:color="auto" w:sz="4"/>
+          <w:left w:val="single" w:color="auto" w:sz="4"/>
+          <w:bottom w:val="single" w:color="auto" w:sz="4"/>
+          <w:right w:val="single" w:color="auto" w:sz="4"/>
+          <w:insideH w:val="single" w:color="auto" w:sz="4"/>
+          <w:insideV w:val="single" w:color="auto" w:sz="4"/>
+        </w:tblBorders>
+      </w:tblPr>
+      <w:tblGrid>
+        <w:gridCol w:w="9360"/>
+      </w:tblGrid>
+      <w:tr>
+        <w:trPr>
+          <w:trHeight w:val="1300" w:hRule="atLeast"/>
+        </w:trPr>
+        <w:tc>
+          <w:tcPr>
+            <w:tcW w:type="dxa" w:w="9360"/>
+            <w:tcBorders>
+              <w:top w:val="single" w:color="888888" w:sz="8"/>
+              <w:left w:val="single" w:color="888888" w:sz="8"/>
+              <w:bottom w:val="single" w:color="888888" w:sz="8"/>
+              <w:right w:val="single" w:color="888888" w:sz="8"/>
+            </w:tcBorders>
+            <w:shd w:fill="FAFAFA" w:val="clear"/>
+            <w:tcMar>
+              <w:top w:type="dxa" w:w="100"/>
+              <w:left w:type="dxa" w:w="140"/>
+              <w:bottom w:type="dxa" w:w="100"/>
+              <w:right w:type="dxa" w:w="140"/>
+            </w:tcMar>
+          </w:tcPr>
+          <w:p>
+            <w:r>
+              <w:t xml:space="preserve"/>
+            </w:r>
+          </w:p>
+        </w:tc>
+      </w:tr>
+    </w:tbl>
+    <w:p>
+      <w:pPr>
+        <w:spacing w:after="100" w:before="320"/>
       </w:pPr>
       <w:r>
         <w:rPr>
@@ -229,53 +229,53 @@
         <w:t xml:space="preserve">This was your first project working with a partner. How did putting your heads together on the concept help you? What was tricky about working together, and how did you handle it?</w:t>
       </w:r>
     </w:p>
-    <w:p>
-      <w:pPr>
-        <w:pBdr>
-          <w:bottom w:val="single" w:color="BBBBBB" w:sz="6" w:space="1"/>
-        </w:pBdr>
-        <w:spacing w:after="0" w:before="220"/>
-      </w:pPr>
-      <w:r>
-        <w:t xml:space="preserve"/>
-      </w:r>
-    </w:p>
-    <w:p>
-      <w:pPr>
-        <w:pBdr>
-          <w:bottom w:val="single" w:color="BBBBBB" w:sz="6" w:space="1"/>
-        </w:pBdr>
-        <w:spacing w:after="0" w:before="220"/>
-      </w:pPr>
-      <w:r>
-        <w:t xml:space="preserve"/>
-      </w:r>
-    </w:p>
-    <w:p>
-      <w:pPr>
-        <w:pBdr>
-          <w:bottom w:val="single" w:color="BBBBBB" w:sz="6" w:space="1"/>
-        </w:pBdr>
-        <w:spacing w:after="0" w:before="220"/>
-      </w:pPr>
-      <w:r>
-        <w:t xml:space="preserve"/>
-      </w:r>
-    </w:p>
-    <w:p>
-      <w:pPr>
-        <w:pBdr>
-          <w:bottom w:val="single" w:color="BBBBBB" w:sz="6" w:space="1"/>
-        </w:pBdr>
-        <w:spacing w:after="0" w:before="220"/>
-      </w:pPr>
-      <w:r>
-        <w:t xml:space="preserve"/>
-      </w:r>
-    </w:p>
-    <w:p>
-      <w:pPr>
-        <w:spacing w:after="60" w:before="280"/>
+    <w:tbl>
+      <w:tblPr>
+        <w:tblW w:type="dxa" w:w="9360"/>
+        <w:tblBorders>
+          <w:top w:val="single" w:color="auto" w:sz="4"/>
+          <w:left w:val="single" w:color="auto" w:sz="4"/>
+          <w:bottom w:val="single" w:color="auto" w:sz="4"/>
+          <w:right w:val="single" w:color="auto" w:sz="4"/>
+          <w:insideH w:val="single" w:color="auto" w:sz="4"/>
+          <w:insideV w:val="single" w:color="auto" w:sz="4"/>
+        </w:tblBorders>
+      </w:tblPr>
+      <w:tblGrid>
+        <w:gridCol w:w="9360"/>
+      </w:tblGrid>
+      <w:tr>
+        <w:trPr>
+          <w:trHeight w:val="1300" w:hRule="atLeast"/>
+        </w:trPr>
+        <w:tc>
+          <w:tcPr>
+            <w:tcW w:type="dxa" w:w="9360"/>
+            <w:tcBorders>
+              <w:top w:val="single" w:color="888888" w:sz="8"/>
+              <w:left w:val="single" w:color="888888" w:sz="8"/>
+              <w:bottom w:val="single" w:color="888888" w:sz="8"/>
+              <w:right w:val="single" w:color="888888" w:sz="8"/>
+            </w:tcBorders>
+            <w:shd w:fill="FAFAFA" w:val="clear"/>
+            <w:tcMar>
+              <w:top w:type="dxa" w:w="100"/>
+              <w:left w:type="dxa" w:w="140"/>
+              <w:bottom w:type="dxa" w:w="100"/>
+              <w:right w:type="dxa" w:w="140"/>
+            </w:tcMar>
+          </w:tcPr>
+          <w:p>
+            <w:r>
+              <w:t xml:space="preserve"/>
+            </w:r>
+          </w:p>
+        </w:tc>
+      </w:tr>
+    </w:tbl>
+    <w:p>
+      <w:pPr>
+        <w:spacing w:after="100" w:before="320"/>
       </w:pPr>
       <w:r>
         <w:rPr>
@@ -300,53 +300,53 @@
         <w:t xml:space="preserve">This was your first time using off-camera flash (the Godox) to light your shot. How did the artificial light change your photo and its mood? What did you learn about lighting?</w:t>
       </w:r>
     </w:p>
-    <w:p>
-      <w:pPr>
-        <w:pBdr>
-          <w:bottom w:val="single" w:color="BBBBBB" w:sz="6" w:space="1"/>
-        </w:pBdr>
-        <w:spacing w:after="0" w:before="220"/>
-      </w:pPr>
-      <w:r>
-        <w:t xml:space="preserve"/>
-      </w:r>
-    </w:p>
-    <w:p>
-      <w:pPr>
-        <w:pBdr>
-          <w:bottom w:val="single" w:color="BBBBBB" w:sz="6" w:space="1"/>
-        </w:pBdr>
-        <w:spacing w:after="0" w:before="220"/>
-      </w:pPr>
-      <w:r>
-        <w:t xml:space="preserve"/>
-      </w:r>
-    </w:p>
-    <w:p>
-      <w:pPr>
-        <w:pBdr>
-          <w:bottom w:val="single" w:color="BBBBBB" w:sz="6" w:space="1"/>
-        </w:pBdr>
-        <w:spacing w:after="0" w:before="220"/>
-      </w:pPr>
-      <w:r>
-        <w:t xml:space="preserve"/>
-      </w:r>
-    </w:p>
-    <w:p>
-      <w:pPr>
-        <w:pBdr>
-          <w:bottom w:val="single" w:color="BBBBBB" w:sz="6" w:space="1"/>
-        </w:pBdr>
-        <w:spacing w:after="0" w:before="220"/>
-      </w:pPr>
-      <w:r>
-        <w:t xml:space="preserve"/>
-      </w:r>
-    </w:p>
-    <w:p>
-      <w:pPr>
-        <w:spacing w:after="60" w:before="280"/>
+    <w:tbl>
+      <w:tblPr>
+        <w:tblW w:type="dxa" w:w="9360"/>
+        <w:tblBorders>
+          <w:top w:val="single" w:color="auto" w:sz="4"/>
+          <w:left w:val="single" w:color="auto" w:sz="4"/>
+          <w:bottom w:val="single" w:color="auto" w:sz="4"/>
+          <w:right w:val="single" w:color="auto" w:sz="4"/>
+          <w:insideH w:val="single" w:color="auto" w:sz="4"/>
+          <w:insideV w:val="single" w:color="auto" w:sz="4"/>
+        </w:tblBorders>
+      </w:tblPr>
+      <w:tblGrid>
+        <w:gridCol w:w="9360"/>
+      </w:tblGrid>
+      <w:tr>
+        <w:trPr>
+          <w:trHeight w:val="1300" w:hRule="atLeast"/>
+        </w:trPr>
+        <w:tc>
+          <w:tcPr>
+            <w:tcW w:type="dxa" w:w="9360"/>
+            <w:tcBorders>
+              <w:top w:val="single" w:color="888888" w:sz="8"/>
+              <w:left w:val="single" w:color="888888" w:sz="8"/>
+              <w:bottom w:val="single" w:color="888888" w:sz="8"/>
+              <w:right w:val="single" w:color="888888" w:sz="8"/>
+            </w:tcBorders>
+            <w:shd w:fill="FAFAFA" w:val="clear"/>
+            <w:tcMar>
+              <w:top w:type="dxa" w:w="100"/>
+              <w:left w:type="dxa" w:w="140"/>
+              <w:bottom w:type="dxa" w:w="100"/>
+              <w:right w:type="dxa" w:w="140"/>
+            </w:tcMar>
+          </w:tcPr>
+          <w:p>
+            <w:r>
+              <w:t xml:space="preserve"/>
+            </w:r>
+          </w:p>
+        </w:tc>
+      </w:tr>
+    </w:tbl>
+    <w:p>
+      <w:pPr>
+        <w:spacing w:after="100" w:before="320"/>
       </w:pPr>
       <w:r>
         <w:rPr>
@@ -371,53 +371,53 @@
         <w:t xml:space="preserve">How did you turn your daytime photo into a scary night scene in Photoshop? Think about the sky, the color, the shadows, and the vignette.</w:t>
       </w:r>
     </w:p>
-    <w:p>
-      <w:pPr>
-        <w:pBdr>
-          <w:bottom w:val="single" w:color="BBBBBB" w:sz="6" w:space="1"/>
-        </w:pBdr>
-        <w:spacing w:after="0" w:before="220"/>
-      </w:pPr>
-      <w:r>
-        <w:t xml:space="preserve"/>
-      </w:r>
-    </w:p>
-    <w:p>
-      <w:pPr>
-        <w:pBdr>
-          <w:bottom w:val="single" w:color="BBBBBB" w:sz="6" w:space="1"/>
-        </w:pBdr>
-        <w:spacing w:after="0" w:before="220"/>
-      </w:pPr>
-      <w:r>
-        <w:t xml:space="preserve"/>
-      </w:r>
-    </w:p>
-    <w:p>
-      <w:pPr>
-        <w:pBdr>
-          <w:bottom w:val="single" w:color="BBBBBB" w:sz="6" w:space="1"/>
-        </w:pBdr>
-        <w:spacing w:after="0" w:before="220"/>
-      </w:pPr>
-      <w:r>
-        <w:t xml:space="preserve"/>
-      </w:r>
-    </w:p>
-    <w:p>
-      <w:pPr>
-        <w:pBdr>
-          <w:bottom w:val="single" w:color="BBBBBB" w:sz="6" w:space="1"/>
-        </w:pBdr>
-        <w:spacing w:after="0" w:before="220"/>
-      </w:pPr>
-      <w:r>
-        <w:t xml:space="preserve"/>
-      </w:r>
-    </w:p>
-    <w:p>
-      <w:pPr>
-        <w:spacing w:after="60" w:before="280"/>
+    <w:tbl>
+      <w:tblPr>
+        <w:tblW w:type="dxa" w:w="9360"/>
+        <w:tblBorders>
+          <w:top w:val="single" w:color="auto" w:sz="4"/>
+          <w:left w:val="single" w:color="auto" w:sz="4"/>
+          <w:bottom w:val="single" w:color="auto" w:sz="4"/>
+          <w:right w:val="single" w:color="auto" w:sz="4"/>
+          <w:insideH w:val="single" w:color="auto" w:sz="4"/>
+          <w:insideV w:val="single" w:color="auto" w:sz="4"/>
+        </w:tblBorders>
+      </w:tblPr>
+      <w:tblGrid>
+        <w:gridCol w:w="9360"/>
+      </w:tblGrid>
+      <w:tr>
+        <w:trPr>
+          <w:trHeight w:val="1300" w:hRule="atLeast"/>
+        </w:trPr>
+        <w:tc>
+          <w:tcPr>
+            <w:tcW w:type="dxa" w:w="9360"/>
+            <w:tcBorders>
+              <w:top w:val="single" w:color="888888" w:sz="8"/>
+              <w:left w:val="single" w:color="888888" w:sz="8"/>
+              <w:bottom w:val="single" w:color="888888" w:sz="8"/>
+              <w:right w:val="single" w:color="888888" w:sz="8"/>
+            </w:tcBorders>
+            <w:shd w:fill="FAFAFA" w:val="clear"/>
+            <w:tcMar>
+              <w:top w:type="dxa" w:w="100"/>
+              <w:left w:type="dxa" w:w="140"/>
+              <w:bottom w:type="dxa" w:w="100"/>
+              <w:right w:type="dxa" w:w="140"/>
+            </w:tcMar>
+          </w:tcPr>
+          <w:p>
+            <w:r>
+              <w:t xml:space="preserve"/>
+            </w:r>
+          </w:p>
+        </w:tc>
+      </w:tr>
+    </w:tbl>
+    <w:p>
+      <w:pPr>
+        <w:spacing w:after="100" w:before="320"/>
       </w:pPr>
       <w:r>
         <w:rPr>
@@ -442,46 +442,51 @@
         <w:t xml:space="preserve">If your movie were real, what would the trailer show? Would you watch it?</w:t>
       </w:r>
     </w:p>
-    <w:p>
-      <w:pPr>
-        <w:pBdr>
-          <w:bottom w:val="single" w:color="BBBBBB" w:sz="6" w:space="1"/>
-        </w:pBdr>
-        <w:spacing w:after="0" w:before="220"/>
-      </w:pPr>
-      <w:r>
-        <w:t xml:space="preserve"/>
-      </w:r>
-    </w:p>
-    <w:p>
-      <w:pPr>
-        <w:pBdr>
-          <w:bottom w:val="single" w:color="BBBBBB" w:sz="6" w:space="1"/>
-        </w:pBdr>
-        <w:spacing w:after="0" w:before="220"/>
-      </w:pPr>
-      <w:r>
-        <w:t xml:space="preserve"/>
-      </w:r>
-    </w:p>
-    <w:p>
-      <w:pPr>
-        <w:pBdr>
-          <w:bottom w:val="single" w:color="BBBBBB" w:sz="6" w:space="1"/>
-        </w:pBdr>
-        <w:spacing w:after="0" w:before="220"/>
-      </w:pPr>
-      <w:r>
-        <w:t xml:space="preserve"/>
-      </w:r>
-    </w:p>
-    <w:p>
-      <w:pPr>
-        <w:pBdr>
-          <w:bottom w:val="single" w:color="BBBBBB" w:sz="6" w:space="1"/>
-        </w:pBdr>
-        <w:spacing w:after="0" w:before="220"/>
-      </w:pPr>
+    <w:tbl>
+      <w:tblPr>
+        <w:tblW w:type="dxa" w:w="9360"/>
+        <w:tblBorders>
+          <w:top w:val="single" w:color="auto" w:sz="4"/>
+          <w:left w:val="single" w:color="auto" w:sz="4"/>
+          <w:bottom w:val="single" w:color="auto" w:sz="4"/>
+          <w:right w:val="single" w:color="auto" w:sz="4"/>
+          <w:insideH w:val="single" w:color="auto" w:sz="4"/>
+          <w:insideV w:val="single" w:color="auto" w:sz="4"/>
+        </w:tblBorders>
+      </w:tblPr>
+      <w:tblGrid>
+        <w:gridCol w:w="9360"/>
+      </w:tblGrid>
+      <w:tr>
+        <w:trPr>
+          <w:trHeight w:val="1300" w:hRule="atLeast"/>
+        </w:trPr>
+        <w:tc>
+          <w:tcPr>
+            <w:tcW w:type="dxa" w:w="9360"/>
+            <w:tcBorders>
+              <w:top w:val="single" w:color="888888" w:sz="8"/>
+              <w:left w:val="single" w:color="888888" w:sz="8"/>
+              <w:bottom w:val="single" w:color="888888" w:sz="8"/>
+              <w:right w:val="single" w:color="888888" w:sz="8"/>
+            </w:tcBorders>
+            <w:shd w:fill="FAFAFA" w:val="clear"/>
+            <w:tcMar>
+              <w:top w:type="dxa" w:w="100"/>
+              <w:left w:type="dxa" w:w="140"/>
+              <w:bottom w:type="dxa" w:w="100"/>
+              <w:right w:type="dxa" w:w="140"/>
+            </w:tcMar>
+          </w:tcPr>
+          <w:p>
+            <w:r>
+              <w:t xml:space="preserve"/>
+            </w:r>
+          </w:p>
+        </w:tc>
+      </w:tr>
+    </w:tbl>
+    <w:p>
       <w:r>
         <w:t xml:space="preserve"/>
       </w:r>

</xml_diff>